<commit_message>
Odswiezony statut.docx z aktualnego statut.md
Co-Authored-By: Claude Opus 5 <noreply@anthropic.com>
Claude-Session: https://claude.ai/code/session_01WR2JsPawQK6ge7oAFtsinp
</commit_message>
<xml_diff>
--- a/statut.docx
+++ b/statut.docx
@@ -2,7 +2,7 @@
 <file path=word/document.xml><?xml version="1.0" encoding="utf-8"?>
 <w:document xmlns:w="http://schemas.openxmlformats.org/wordprocessingml/2006/main" xmlns:m="http://schemas.openxmlformats.org/officeDocument/2006/math" xmlns:r="http://schemas.openxmlformats.org/officeDocument/2006/relationships" xmlns:o="urn:schemas-microsoft-com:office:office" xmlns:v="urn:schemas-microsoft-com:vml" xmlns:w10="urn:schemas-microsoft-com:office:word" xmlns:a="http://schemas.openxmlformats.org/drawingml/2006/main" xmlns:pic="http://schemas.openxmlformats.org/drawingml/2006/picture" xmlns:wp="http://schemas.openxmlformats.org/drawingml/2006/wordprocessingDrawing">
   <w:body>
-    <w:bookmarkStart w:id="30" w:name="Xc4ee6d0185d0942eb885bb5dffc93cfece1cc48"/>
+    <w:bookmarkStart w:id="31" w:name="Xc4ee6d0185d0942eb885bb5dffc93cfece1cc48"/>
     <w:p>
       <w:pPr>
         <w:pStyle w:val="Heading1"/>
@@ -366,7 +366,19 @@
         <w:t xml:space="preserve"> </w:t>
       </w:r>
       <w:r>
-        <w:t xml:space="preserve">5. promowanie postawy dociekliwości i rzetelności poznawczej.</w:t>
+        <w:t xml:space="preserve">5. wspieranie twórczości artystycznej podejmującej temat sztucznej inteligencji i jej roli w życiu człowieka - w dziedzinie filmu, muzyki i sztuk plastycznych;</w:t>
+      </w:r>
+      <w:r>
+        <w:t xml:space="preserve"> </w:t>
+      </w:r>
+      <w:r>
+        <w:t xml:space="preserve">6. upowszechnianie dostępu do dóbr kultury powstałych w ten sposób, w szczególności przez ich nieodpłatne udostępnianie;</w:t>
+      </w:r>
+      <w:r>
+        <w:t xml:space="preserve"> </w:t>
+      </w:r>
+      <w:r>
+        <w:t xml:space="preserve">7. promowanie postawy dociekliwości i rzetelności poznawczej.</w:t>
       </w:r>
     </w:p>
     <w:p>
@@ -406,19 +418,25 @@
         <w:t xml:space="preserve"> </w:t>
       </w:r>
       <w:r>
-        <w:t xml:space="preserve">- corocznego konkursu dla osób prowadzących rozmowy ze sztuczną inteligencją - w tym składanie przyrzeczeń publicznych i wypłatę nagród;</w:t>
-      </w:r>
-      <w:r>
-        <w:t xml:space="preserve"> </w:t>
-      </w:r>
-      <w:r>
-        <w:t xml:space="preserve">2. wydawanie i nieodpłatne udostępnianie antologii nagrodzonych rozmów oraz prowadzenie publicznego archiwum rozmów;</w:t>
-      </w:r>
-      <w:r>
-        <w:t xml:space="preserve"> </w:t>
-      </w:r>
-      <w:r>
-        <w:t xml:space="preserve">3. prowadzenie działalności wydawniczej, także we współpracy z wydawcami zewnętrznymi;</w:t>
+        <w:t xml:space="preserve">- corocznej nagrody przyznawanej w plebiscytach: na rozmowę ze sztuczną inteligencją, na film o sztucznej inteligencji, na piosenkę o sztucznej inteligencji i na plakat o sztucznej inteligencji - w tym składanie przyrzeczeń publicznych i wypłatę nagród;</w:t>
+      </w:r>
+      <w:r>
+        <w:t xml:space="preserve"> </w:t>
+      </w:r>
+      <w:r>
+        <w:t xml:space="preserve">2. wydawanie i nieodpłatne udostępnianie antologii nagrodzonych rozmów oraz prowadzenie publicznego Archiwum zgłoszeń we wszystkich plebiscytach;</w:t>
+      </w:r>
+      <w:r>
+        <w:t xml:space="preserve"> </w:t>
+      </w:r>
+      <w:r>
+        <w:t xml:space="preserve">3. prowadzenie działalności wydawniczej i fonograficznej, także we współpracy z wydawcami zewnętrznymi, w tym wydawanie nagrań utworów nagrodzonych i finałowych;</w:t>
+      </w:r>
+      <w:r>
+        <w:t xml:space="preserve"> </w:t>
+      </w:r>
+      <w:r>
+        <w:t xml:space="preserve">3a. organizowanie wystaw, pokazów filmowych i koncertów prezentujących prace zgłoszone do plebiscytów;</w:t>
       </w:r>
       <w:r>
         <w:t xml:space="preserve"> </w:t>
@@ -1149,7 +1167,7 @@
           <w:bCs/>
           <w:b/>
         </w:rPr>
-        <w:t xml:space="preserve">[DO USTALENIA: kody PKD - wydawanie książek, działalność wydawnicza, działalność edukacyjna, reklama]</w:t>
+        <w:t xml:space="preserve">[DO USTALENIA: kody PKD - wydawanie książek, działalność wydawnicza, działalność w zakresie nagrań dźwiękowych i muzyczna, działalność związana z wystawianiem przedstawień i projekcją filmów, działalność edukacyjna, reklama]</w:t>
       </w:r>
       <w:r>
         <w:t xml:space="preserve">.</w:t>
@@ -1318,13 +1336,21 @@
       </w:r>
     </w:p>
     <w:bookmarkEnd w:id="28"/>
-    <w:bookmarkStart w:id="29" w:name="X2dacb25f89896b49f2cd201fe85534dd2e6e3f7"/>
+    <w:bookmarkStart w:id="29" w:name="pytania-do-kancelarii"/>
     <w:p>
       <w:pPr>
         <w:pStyle w:val="Heading2"/>
       </w:pPr>
       <w:r>
-        <w:t xml:space="preserve">Lista decyzji do podjęcia przed notariuszem</w:t>
+        <w:t xml:space="preserve">Pytania do kancelarii</w:t>
+      </w:r>
+    </w:p>
+    <w:p>
+      <w:pPr>
+        <w:pStyle w:val="FirstParagraph"/>
+      </w:pPr>
+      <w:r>
+        <w:t xml:space="preserve">Pytania wynikają wprost ze znaczników w tekście powyżej i są ułożone w kolejności paragrafów. Każde dotyczy brzmienia zapisu, a nie wyboru biznesowego - wybory biznesowe są w następnej sekcji.</w:t>
       </w:r>
     </w:p>
     <w:p>
@@ -1336,23 +1362,17 @@
         <w:pStyle w:val="Compact"/>
       </w:pPr>
       <w:r>
-        <w:t xml:space="preserve">Nazwa Fundacji -</w:t>
-      </w:r>
-      <w:r>
-        <w:t xml:space="preserve"> </w:t>
-      </w:r>
-      <w:r>
-        <w:rPr>
-          <w:bCs/>
-          <w:b/>
-        </w:rPr>
-        <w:t xml:space="preserve">rozstrzygnięte 22.10.2026: Fundacja Konstela.</w:t>
-      </w:r>
-      <w:r>
-        <w:t xml:space="preserve"> </w:t>
-      </w:r>
-      <w:r>
-        <w:t xml:space="preserve">Pozostaje do sprawdzenia dostępność w KRS i kolizja ze znakami towarowymi.</w:t>
+        <w:rPr>
+          <w:bCs/>
+          <w:b/>
+        </w:rPr>
+        <w:t xml:space="preserve">§ 4 ust. 2 - działalność poza granicami kraju.</w:t>
+      </w:r>
+      <w:r>
+        <w:t xml:space="preserve"> </w:t>
+      </w:r>
+      <w:r>
+        <w:t xml:space="preserve">Czy brzmienie „może prowadzić działalność poza granicami kraju, zgodnie z prawem miejscowym” wystarczy pod planowaną międzynarodową odsłonę Nagrody, czy potrzebny jest zapis szerszy albo wskazanie formy (oddział, przedstawicielstwo)?</w:t>
       </w:r>
     </w:p>
     <w:p>
@@ -1364,17 +1384,17 @@
         <w:pStyle w:val="Compact"/>
       </w:pPr>
       <w:r>
-        <w:t xml:space="preserve">Siedziba -</w:t>
-      </w:r>
-      <w:r>
-        <w:t xml:space="preserve"> </w:t>
-      </w:r>
-      <w:r>
-        <w:rPr>
-          <w:bCs/>
-          <w:b/>
-        </w:rPr>
-        <w:t xml:space="preserve">rozstrzygnięte 22.10.2026: Sieradz.</w:t>
+        <w:rPr>
+          <w:bCs/>
+          <w:b/>
+        </w:rPr>
+        <w:t xml:space="preserve">§ 5 - minister nadzoru.</w:t>
+      </w:r>
+      <w:r>
+        <w:t xml:space="preserve"> </w:t>
+      </w:r>
+      <w:r>
+        <w:t xml:space="preserve">Cele z § 8 obejmują zarówno kompetencje cyfrowe, jak i twórczość artystyczną - film, muzykę i sztuki plastyczne. Czy przy takim zakresie właściwy jest minister do spraw informatyzacji, czy raczej minister do spraw kultury albo oświaty i wychowania? Czy przy celach mieszanych można wskazać jednego ministra bez ryzyka sporu kompetencyjnego przy rejestracji?</w:t>
       </w:r>
     </w:p>
     <w:p>
@@ -1390,13 +1410,13 @@
           <w:bCs/>
           <w:b/>
         </w:rPr>
-        <w:t xml:space="preserve">Fundusz założycielski</w:t>
-      </w:r>
-      <w:r>
-        <w:t xml:space="preserve"> </w:t>
-      </w:r>
-      <w:r>
-        <w:t xml:space="preserve">- łączna kwota i część na działalność gospodarczą (księgowy).</w:t>
+        <w:t xml:space="preserve">§ 12 - fundusz założycielski.</w:t>
+      </w:r>
+      <w:r>
+        <w:t xml:space="preserve"> </w:t>
+      </w:r>
+      <w:r>
+        <w:t xml:space="preserve">Czy wyodrębnienie części funduszu na działalność gospodarczą musi znaleźć się w samym statucie, czy wystarczy w oświadczeniu woli fundatora? Czy kwota poniżej 1000 zł na działalność gospodarczą jest podstawą odmowy wpisu do rejestru przedsiębiorców?</w:t>
       </w:r>
     </w:p>
     <w:p>
@@ -1412,13 +1432,13 @@
           <w:bCs/>
           <w:b/>
         </w:rPr>
-        <w:t xml:space="preserve">Kody PKD</w:t>
-      </w:r>
-      <w:r>
-        <w:t xml:space="preserve"> </w:t>
-      </w:r>
-      <w:r>
-        <w:t xml:space="preserve">dla działalności gospodarczej (biuro księgowe obsługujące organizacje pozarządowe - Globico nie prowadzi fundacji).</w:t>
+        <w:t xml:space="preserve">§ 14 ust. 2 - zabezpieczenie puli nagród.</w:t>
+      </w:r>
+      <w:r>
+        <w:t xml:space="preserve"> </w:t>
+      </w:r>
+      <w:r>
+        <w:t xml:space="preserve">Czy zapis „środki przekazane na pulę nagród konkretnej edycji przeznaczane są wyłącznie na ten cel” wystarczy, aby pula była chroniona przed wierzycielami Fundacji i przed przeznaczeniem jej na bieżącą działalność, czy potrzebny jest rachunek powierniczy albo odrębny rachunek z zastrzeżeniem celu?</w:t>
       </w:r>
     </w:p>
     <w:p>
@@ -1434,13 +1454,13 @@
           <w:bCs/>
           <w:b/>
         </w:rPr>
-        <w:t xml:space="preserve">Liczebność Rady</w:t>
-      </w:r>
-      <w:r>
-        <w:t xml:space="preserve"> </w:t>
-      </w:r>
-      <w:r>
-        <w:t xml:space="preserve">- dwie czy trzy osoby.</w:t>
+        <w:t xml:space="preserve">§ 17 ust. 2 - następstwo uprawnień Fundatora.</w:t>
+      </w:r>
+      <w:r>
+        <w:t xml:space="preserve"> </w:t>
+      </w:r>
+      <w:r>
+        <w:t xml:space="preserve">Czy przejście uprawnień Fundatora na Radę Fundacji po jego śmierci jest skuteczne na podstawie samego statutu? Czy uprawnienia fundatora podlegają dziedziczeniu, jeżeli statut milczy, i czy trzeba to wyłączyć wprost?</w:t>
       </w:r>
     </w:p>
     <w:p>
@@ -1452,17 +1472,17 @@
         <w:pStyle w:val="Compact"/>
       </w:pPr>
       <w:r>
-        <w:t xml:space="preserve">Kadencja Zarządu -</w:t>
-      </w:r>
-      <w:r>
-        <w:t xml:space="preserve"> </w:t>
-      </w:r>
-      <w:r>
-        <w:rPr>
-          <w:bCs/>
-          <w:b/>
-        </w:rPr>
-        <w:t xml:space="preserve">rozstrzygnięte 22.10.2026: bezterminowa.</w:t>
+        <w:rPr>
+          <w:bCs/>
+          <w:b/>
+        </w:rPr>
+        <w:t xml:space="preserve">§ 19 - reprezentacja.</w:t>
+      </w:r>
+      <w:r>
+        <w:t xml:space="preserve"> </w:t>
+      </w:r>
+      <w:r>
+        <w:t xml:space="preserve">Czy przy zarządzie wieloosobowym bezpieczniejsza jest reprezentacja łączna dwóch członków albo członka z prokurentem? Jakie są skutki samodzielnej reprezentacji przy umowach z partnerami finansującymi pulę nagród?</w:t>
       </w:r>
     </w:p>
     <w:p>
@@ -1478,13 +1498,13 @@
           <w:bCs/>
           <w:b/>
         </w:rPr>
-        <w:t xml:space="preserve">Wpis do rejestru przedsiębiorców od razu</w:t>
-      </w:r>
-      <w:r>
-        <w:t xml:space="preserve"> </w:t>
-      </w:r>
-      <w:r>
-        <w:t xml:space="preserve">czy dopiero przy rozpoczęciu działalności gospodarczej - wpływa na opłatę sądową i sprawozdawczość (księgowy).</w:t>
+        <w:t xml:space="preserve">§ 20 ust. 2 - powoływanie Rady przez Fundatora.</w:t>
+      </w:r>
+      <w:r>
+        <w:t xml:space="preserve"> </w:t>
+      </w:r>
+      <w:r>
+        <w:t xml:space="preserve">Czy Fundator będący jednocześnie członkiem Zarządu może powoływać i odwoływać organ, który ma Zarząd kontrolować? Czy taka konstrukcja nie podważa nadzoru wewnętrznego w oczach sądu rejestrowego albo grantodawcy?</w:t>
       </w:r>
     </w:p>
     <w:p>
@@ -1500,13 +1520,13 @@
           <w:bCs/>
           <w:b/>
         </w:rPr>
-        <w:t xml:space="preserve">Minister nadzoru</w:t>
-      </w:r>
-      <w:r>
-        <w:t xml:space="preserve"> </w:t>
-      </w:r>
-      <w:r>
-        <w:t xml:space="preserve">- czy cyfryzacji przy tych celach (prawnik, pytanie 37).</w:t>
+        <w:t xml:space="preserve">§ 23 ust. 3 - kody PKD.</w:t>
+      </w:r>
+      <w:r>
+        <w:t xml:space="preserve"> </w:t>
+      </w:r>
+      <w:r>
+        <w:t xml:space="preserve">Czy proponowany zakres (działalność wydawnicza i fonograficzna, organizacja wystaw, pokazów i koncertów, działalność edukacyjna, reklama) wymaga doprecyzowania w statucie co do klas, czy wystarczy wskazanie przedmiotu działalności słowami?</w:t>
       </w:r>
     </w:p>
     <w:p>
@@ -1518,6 +1538,294 @@
         <w:pStyle w:val="Compact"/>
       </w:pPr>
       <w:r>
+        <w:rPr>
+          <w:bCs/>
+          <w:b/>
+        </w:rPr>
+        <w:t xml:space="preserve">§ 25 - zmiana Statutu i celów.</w:t>
+      </w:r>
+      <w:r>
+        <w:t xml:space="preserve"> </w:t>
+      </w:r>
+      <w:r>
+        <w:t xml:space="preserve">Czy zmiana celów Fundacji przez Fundatora jednoosobowo jest dopuszczalna, a jeżeli tak, czy wymaga zastrzeżenia w akcie fundacyjnym? Czy po śmierci Fundatora konstrukcja „Zarząd za zgodą Rady” jest wystarczająca?</w:t>
+      </w:r>
+    </w:p>
+    <w:p>
+      <w:pPr>
+        <w:numPr>
+          <w:ilvl w:val="0"/>
+          <w:numId w:val="1001"/>
+        </w:numPr>
+        <w:pStyle w:val="Compact"/>
+      </w:pPr>
+      <w:r>
+        <w:rPr>
+          <w:bCs/>
+          <w:b/>
+        </w:rPr>
+        <w:t xml:space="preserve">§ 27 ust. 3 - przeznaczenie majątku po likwidacji.</w:t>
+      </w:r>
+      <w:r>
+        <w:t xml:space="preserve"> </w:t>
+      </w:r>
+      <w:r>
+        <w:t xml:space="preserve">Czy można wskazać cel ogólny („cele zbieżne z celami Fundacji”), czy sąd oczekuje wskazania konkretnego podmiotu albo sposobu jego wyboru?</w:t>
+      </w:r>
+    </w:p>
+    <w:p>
+      <w:pPr>
+        <w:numPr>
+          <w:ilvl w:val="0"/>
+          <w:numId w:val="1001"/>
+        </w:numPr>
+        <w:pStyle w:val="Compact"/>
+      </w:pPr>
+      <w:r>
+        <w:rPr>
+          <w:bCs/>
+          <w:b/>
+        </w:rPr>
+        <w:t xml:space="preserve">Przyrzeczenie publiczne a fundacja.</w:t>
+      </w:r>
+      <w:r>
+        <w:t xml:space="preserve"> </w:t>
+      </w:r>
+      <w:r>
+        <w:t xml:space="preserve">Czy regulaminy plebiscytów, konstruowane jako przyrzeczenie publiczne (art. 919 k.c.), wymagają podstawy w statucie, czy wystarczy, że mieszczą się w celach statutowych?</w:t>
+      </w:r>
+    </w:p>
+    <w:p>
+      <w:pPr>
+        <w:numPr>
+          <w:ilvl w:val="0"/>
+          <w:numId w:val="1001"/>
+        </w:numPr>
+        <w:pStyle w:val="Compact"/>
+      </w:pPr>
+      <w:r>
+        <w:rPr>
+          <w:bCs/>
+          <w:b/>
+        </w:rPr>
+        <w:t xml:space="preserve">Nagrody dla osób niepełnoletnich.</w:t>
+      </w:r>
+      <w:r>
+        <w:t xml:space="preserve"> </w:t>
+      </w:r>
+      <w:r>
+        <w:t xml:space="preserve">Czy wypłata nagrody pieniężnej osobie od 16. roku życia wymaga czegoś więcej niż zgody przedstawiciela ustawowego, i czy statut powinien to przewidywać?</w:t>
+      </w:r>
+    </w:p>
+    <w:bookmarkEnd w:id="29"/>
+    <w:bookmarkStart w:id="30" w:name="decyzje-dla-notariusza-i-księgowego"/>
+    <w:p>
+      <w:pPr>
+        <w:pStyle w:val="Heading2"/>
+      </w:pPr>
+      <w:r>
+        <w:t xml:space="preserve">Decyzje dla notariusza i księgowego</w:t>
+      </w:r>
+    </w:p>
+    <w:p>
+      <w:pPr>
+        <w:pStyle w:val="FirstParagraph"/>
+      </w:pPr>
+      <w:r>
+        <w:t xml:space="preserve">To nie są pytania prawne, tylko wybory, które trzeba podjąć przed aktem notarialnym.</w:t>
+      </w:r>
+    </w:p>
+    <w:p>
+      <w:pPr>
+        <w:numPr>
+          <w:ilvl w:val="0"/>
+          <w:numId w:val="1002"/>
+        </w:numPr>
+        <w:pStyle w:val="Compact"/>
+      </w:pPr>
+      <w:r>
+        <w:t xml:space="preserve">Nazwa Fundacji -</w:t>
+      </w:r>
+      <w:r>
+        <w:t xml:space="preserve"> </w:t>
+      </w:r>
+      <w:r>
+        <w:rPr>
+          <w:bCs/>
+          <w:b/>
+        </w:rPr>
+        <w:t xml:space="preserve">rozstrzygnięte 22.10.2026: Fundacja Konstela.</w:t>
+      </w:r>
+      <w:r>
+        <w:t xml:space="preserve"> </w:t>
+      </w:r>
+      <w:r>
+        <w:t xml:space="preserve">Pozostaje do sprawdzenia dostępność w KRS i kolizja ze znakami towarowymi.</w:t>
+      </w:r>
+    </w:p>
+    <w:p>
+      <w:pPr>
+        <w:numPr>
+          <w:ilvl w:val="0"/>
+          <w:numId w:val="1002"/>
+        </w:numPr>
+        <w:pStyle w:val="Compact"/>
+      </w:pPr>
+      <w:r>
+        <w:t xml:space="preserve">Siedziba -</w:t>
+      </w:r>
+      <w:r>
+        <w:t xml:space="preserve"> </w:t>
+      </w:r>
+      <w:r>
+        <w:rPr>
+          <w:bCs/>
+          <w:b/>
+        </w:rPr>
+        <w:t xml:space="preserve">rozstrzygnięte 22.10.2026: Sieradz.</w:t>
+      </w:r>
+    </w:p>
+    <w:p>
+      <w:pPr>
+        <w:numPr>
+          <w:ilvl w:val="0"/>
+          <w:numId w:val="1002"/>
+        </w:numPr>
+        <w:pStyle w:val="Compact"/>
+      </w:pPr>
+      <w:r>
+        <w:rPr>
+          <w:bCs/>
+          <w:b/>
+        </w:rPr>
+        <w:t xml:space="preserve">Fundusz założycielski</w:t>
+      </w:r>
+      <w:r>
+        <w:t xml:space="preserve"> </w:t>
+      </w:r>
+      <w:r>
+        <w:t xml:space="preserve">- łączna kwota i część na działalność gospodarczą (księgowy).</w:t>
+      </w:r>
+    </w:p>
+    <w:p>
+      <w:pPr>
+        <w:numPr>
+          <w:ilvl w:val="0"/>
+          <w:numId w:val="1002"/>
+        </w:numPr>
+        <w:pStyle w:val="Compact"/>
+      </w:pPr>
+      <w:r>
+        <w:rPr>
+          <w:bCs/>
+          <w:b/>
+        </w:rPr>
+        <w:t xml:space="preserve">Kody PKD</w:t>
+      </w:r>
+      <w:r>
+        <w:t xml:space="preserve"> </w:t>
+      </w:r>
+      <w:r>
+        <w:t xml:space="preserve">dla działalności gospodarczej (biuro księgowe obsługujące organizacje pozarządowe - Globico nie prowadzi fundacji).</w:t>
+      </w:r>
+    </w:p>
+    <w:p>
+      <w:pPr>
+        <w:numPr>
+          <w:ilvl w:val="0"/>
+          <w:numId w:val="1002"/>
+        </w:numPr>
+        <w:pStyle w:val="Compact"/>
+      </w:pPr>
+      <w:r>
+        <w:rPr>
+          <w:bCs/>
+          <w:b/>
+        </w:rPr>
+        <w:t xml:space="preserve">Liczebność Rady</w:t>
+      </w:r>
+      <w:r>
+        <w:t xml:space="preserve"> </w:t>
+      </w:r>
+      <w:r>
+        <w:t xml:space="preserve">- dwie czy trzy osoby.</w:t>
+      </w:r>
+    </w:p>
+    <w:p>
+      <w:pPr>
+        <w:numPr>
+          <w:ilvl w:val="0"/>
+          <w:numId w:val="1002"/>
+        </w:numPr>
+        <w:pStyle w:val="Compact"/>
+      </w:pPr>
+      <w:r>
+        <w:t xml:space="preserve">Kadencja Zarządu -</w:t>
+      </w:r>
+      <w:r>
+        <w:t xml:space="preserve"> </w:t>
+      </w:r>
+      <w:r>
+        <w:rPr>
+          <w:bCs/>
+          <w:b/>
+        </w:rPr>
+        <w:t xml:space="preserve">rozstrzygnięte 22.10.2026: bezterminowa.</w:t>
+      </w:r>
+    </w:p>
+    <w:p>
+      <w:pPr>
+        <w:numPr>
+          <w:ilvl w:val="0"/>
+          <w:numId w:val="1002"/>
+        </w:numPr>
+        <w:pStyle w:val="Compact"/>
+      </w:pPr>
+      <w:r>
+        <w:rPr>
+          <w:bCs/>
+          <w:b/>
+        </w:rPr>
+        <w:t xml:space="preserve">Wpis do rejestru przedsiębiorców od razu</w:t>
+      </w:r>
+      <w:r>
+        <w:t xml:space="preserve"> </w:t>
+      </w:r>
+      <w:r>
+        <w:t xml:space="preserve">czy dopiero przy rozpoczęciu działalności gospodarczej - wpływa na opłatę sądową i sprawozdawczość (księgowy).</w:t>
+      </w:r>
+    </w:p>
+    <w:p>
+      <w:pPr>
+        <w:numPr>
+          <w:ilvl w:val="0"/>
+          <w:numId w:val="1002"/>
+        </w:numPr>
+        <w:pStyle w:val="Compact"/>
+      </w:pPr>
+      <w:r>
+        <w:rPr>
+          <w:bCs/>
+          <w:b/>
+        </w:rPr>
+        <w:t xml:space="preserve">Minister nadzoru</w:t>
+      </w:r>
+      <w:r>
+        <w:t xml:space="preserve"> </w:t>
+      </w:r>
+      <w:r>
+        <w:t xml:space="preserve">- czy cyfryzacji przy tych celach (prawnik, pytanie 37).</w:t>
+      </w:r>
+    </w:p>
+    <w:p>
+      <w:pPr>
+        <w:numPr>
+          <w:ilvl w:val="0"/>
+          <w:numId w:val="1002"/>
+        </w:numPr>
+        <w:pStyle w:val="Compact"/>
+      </w:pPr>
+      <w:r>
         <w:t xml:space="preserve">Wyłączenie członków organów z udziału w konkursach -</w:t>
       </w:r>
       <w:r>
@@ -1531,8 +1839,8 @@
         <w:t xml:space="preserve">rozstrzygnięte 22.10.2026: wpisane do statutu jako § 11.</w:t>
       </w:r>
     </w:p>
-    <w:bookmarkEnd w:id="29"/>
     <w:bookmarkEnd w:id="30"/>
+    <w:bookmarkEnd w:id="31"/>
     <w:sectPr/>
   </w:body>
 </w:document>
@@ -1728,6 +2036,36 @@
     <w:abstractNumId w:val="990"/>
   </w:num>
   <w:num w:numId="1001">
+    <w:abstractNumId w:val="99411"/>
+    <w:lvlOverride w:ilvl="0">
+      <w:startOverride w:val="1"/>
+    </w:lvlOverride>
+    <w:lvlOverride w:ilvl="1">
+      <w:startOverride w:val="1"/>
+    </w:lvlOverride>
+    <w:lvlOverride w:ilvl="2">
+      <w:startOverride w:val="1"/>
+    </w:lvlOverride>
+    <w:lvlOverride w:ilvl="3">
+      <w:startOverride w:val="1"/>
+    </w:lvlOverride>
+    <w:lvlOverride w:ilvl="4">
+      <w:startOverride w:val="1"/>
+    </w:lvlOverride>
+    <w:lvlOverride w:ilvl="5">
+      <w:startOverride w:val="1"/>
+    </w:lvlOverride>
+    <w:lvlOverride w:ilvl="6">
+      <w:startOverride w:val="1"/>
+    </w:lvlOverride>
+    <w:lvlOverride w:ilvl="7">
+      <w:startOverride w:val="1"/>
+    </w:lvlOverride>
+    <w:lvlOverride w:ilvl="8">
+      <w:startOverride w:val="1"/>
+    </w:lvlOverride>
+  </w:num>
+  <w:num w:numId="1002">
     <w:abstractNumId w:val="99411"/>
     <w:lvlOverride w:ilvl="0">
       <w:startOverride w:val="1"/>

</xml_diff>